<commit_message>
Add Alpha Omega Media (AOM) experience entry and refresh skills section
- Add current AOM role (Jul 2026 - Present) as the lead EXPERIENCE entry:
  company context line, contractor engagement type, and 8 quantified bullets
- Refresh SKILLS with facts supported by the AOM work: Python, Oracle Fusion
  Cloud ERP modules, procure-to-pay process analysis, vendor/contract
  compliance review, executive stakeholder communication, bilingual docs
</commit_message>
<xml_diff>
--- a/Pedro_Cardona_Master_Resume.docx
+++ b/Pedro_Cardona_Master_Resume.docx
@@ -234,7 +234,7 @@
         <w:t xml:space="preserve">Backend &amp; Data  </w:t>
       </w:r>
       <w:r>
-        <w:t>SQL (query optimization, indexing, joins), JavaScript, Java, REST APIs, Firebase, Power BI, dashboard development, ETL workflows</w:t>
+        <w:t>SQL (query optimization, indexing, joins), Python (API automation, data parsing), JavaScript, Java, REST APIs, Firebase, Power BI, dashboard development, ETL workflows, large-scale data reconciliation</w:t>
       </w:r>
     </w:p>
     <w:p>
@@ -274,7 +274,7 @@
         <w:t xml:space="preserve">Cloud &amp; Platforms  </w:t>
       </w:r>
       <w:r>
-        <w:t xml:space="preserve">Microsoft Azure (Power Platform), Google Cloud (Firebase), Microsoft Power Apps, </w:t>
+        <w:t xml:space="preserve">Oracle Fusion Cloud ERP (Payables, Procurement, Budgetary Control, General Ledger), Microsoft Azure (Power Platform), Google Cloud (Firebase), Microsoft Power Apps, </w:t>
       </w:r>
       <w:proofErr w:type="spellStart"/>
       <w:r>
@@ -295,7 +295,7 @@
         <w:t xml:space="preserve">Workflow &amp; Collaboration  </w:t>
       </w:r>
       <w:r>
-        <w:t>Git, GitHub, Agile, requirements gathering, cross-functional delivery, change management, user training</w:t>
+        <w:t>Git, GitHub, Agile, business process analysis (procure-to-pay), requirements gathering, vendor &amp; contract compliance review, executive stakeholder communication, bilingual technical documentation, cross-functional delivery, change management, user training</w:t>
       </w:r>
     </w:p>
     <w:p>
@@ -331,6 +331,230 @@
           <w:szCs w:val="24"/>
         </w:rPr>
         <w:t>EXPERIENCE</w:t>
+      </w:r>
+    </w:p>
+    <w:p>
+      <w:pPr>
+        <w:tabs>
+          <w:tab w:val="right" w:pos="10080"/>
+        </w:tabs>
+        <w:spacing w:before="100" w:line="276" w:lineRule="auto"/>
+      </w:pPr>
+      <w:r>
+        <w:rPr>
+          <w:b/>
+          <w:bCs/>
+          <w:sz w:val="24"/>
+          <w:szCs w:val="24"/>
+        </w:rPr>
+        <w:t>Alpha Omega Media, LLC</w:t>
+      </w:r>
+      <w:r>
+        <w:rPr>
+          <w:color w:val="595959"/>
+        </w:rPr>
+        <w:t xml:space="preserve">  |  Puerto Rico · Remote</w:t>
+      </w:r>
+      <w:r>
+        <w:rPr>
+          <w:color w:val="595959"/>
+        </w:rPr>
+        <w:tab/>
+        <w:t>July 2026 – Present</w:t>
+      </w:r>
+    </w:p>
+    <w:p>
+      <w:pPr>
+        <w:spacing w:after="20" w:line="276" w:lineRule="auto"/>
+      </w:pPr>
+      <w:r>
+        <w:rPr>
+          <w:i/>
+          <w:iCs/>
+          <w:color w:val="1A365D"/>
+        </w:rPr>
+        <w:t>Business &amp; BI Analyst / Incident Coordinator</w:t>
+      </w:r>
+      <w:r>
+        <w:rPr>
+          <w:i/>
+          <w:iCs/>
+          <w:color w:val="595959"/>
+        </w:rPr>
+        <w:t xml:space="preserve">  ·  Contractor (Professional Services)</w:t>
+      </w:r>
+    </w:p>
+    <w:p>
+      <w:pPr>
+        <w:spacing w:after="60" w:line="276" w:lineRule="auto"/>
+      </w:pPr>
+      <w:r>
+        <w:rPr>
+          <w:color w:val="595959"/>
+          <w:sz w:val="20"/>
+          <w:szCs w:val="20"/>
+        </w:rPr>
+        <w:t>Puerto Rico-based technology consulting firm specializing in digital transformation, advanced analytics, and cloud architecture for highly regulated public- and private-sector organizations; technical leadership includes a former Chief Information Officer of the Government of Puerto Rico. Engaged on the firm's flagship program: the Government of Puerto Rico's enterprise resource planning modernization, a migration from PeopleSoft to Oracle Fusion Cloud covering Finance, Supply Chain, and Procurement across dozens of agencies.</w:t>
+      </w:r>
+    </w:p>
+    <w:p>
+      <w:pPr>
+        <w:pStyle w:val="ListParagraph"/>
+        <w:numPr>
+          <w:ilvl w:val="0"/>
+          <w:numId w:val="2"/>
+        </w:numPr>
+        <w:spacing w:before="30" w:after="30" w:line="276" w:lineRule="auto"/>
+      </w:pPr>
+      <w:r>
+        <w:rPr>
+          <w:b/>
+          <w:bCs/>
+        </w:rPr>
+        <w:t>Designed and directed the build of the Government of Puerto Rico's first unified procure-to-pay analytics platform</w:t>
+      </w:r>
+      <w:r>
+        <w:t xml:space="preserve">, consolidating 8 production data extracts (~240,000 rows across 40 spreadsheet tabs) from multiple government finance systems into a single 10-view application spanning requisition through invoice three-way match for ~8,800 suppliers across 60 agencies.</w:t>
+      </w:r>
+    </w:p>
+    <w:p>
+      <w:pPr>
+        <w:pStyle w:val="ListParagraph"/>
+        <w:numPr>
+          <w:ilvl w:val="0"/>
+          <w:numId w:val="2"/>
+        </w:numPr>
+        <w:spacing w:before="30" w:after="30" w:line="276" w:lineRule="auto"/>
+      </w:pPr>
+      <w:r>
+        <w:rPr>
+          <w:b/>
+          <w:bCs/>
+        </w:rPr>
+        <w:t>Verified $3.9B in purchase order value to the cent</w:t>
+      </w:r>
+      <w:r>
+        <w:t xml:space="preserve"> against source systems, alongside $1.89B in pending obligations, $1.2B paid to suppliers, $396.7M held in invoice holds, and $3.04B in authorized purchasing-agreement limits across 113,000+ historical contracts.</w:t>
+      </w:r>
+    </w:p>
+    <w:p>
+      <w:pPr>
+        <w:pStyle w:val="ListParagraph"/>
+        <w:numPr>
+          <w:ilvl w:val="0"/>
+          <w:numId w:val="2"/>
+        </w:numPr>
+        <w:spacing w:before="30" w:after="30" w:line="276" w:lineRule="auto"/>
+      </w:pPr>
+      <w:r>
+        <w:rPr>
+          <w:b/>
+          <w:bCs/>
+        </w:rPr>
+        <w:t>Engineered the full data pipeline to run offline</w:t>
+      </w:r>
+      <w:r>
+        <w:t xml:space="preserve"> for a client with no guaranteed internet access, compressing a 24.5MB dataset to a 5.46MB self-contained file via dictionary encoding and gzip/base64 with in-browser decompression and zero external dependencies; diagnosed a production hang traced to a hidden CDN dependency, rebuilt every code path to fail visibly rather than stall, and re-verified on a fully disconnected machine with an automated functional test suite.</w:t>
+      </w:r>
+    </w:p>
+    <w:p>
+      <w:pPr>
+        <w:pStyle w:val="ListParagraph"/>
+        <w:numPr>
+          <w:ilvl w:val="0"/>
+          <w:numId w:val="2"/>
+        </w:numPr>
+        <w:spacing w:before="30" w:after="30" w:line="276" w:lineRule="auto"/>
+      </w:pPr>
+      <w:r>
+        <w:rPr>
+          <w:b/>
+          <w:bCs/>
+        </w:rPr>
+        <w:t>Surfaced internal-control gaps the government's own reporting had missed</w:t>
+      </w:r>
+      <w:r>
+        <w:t xml:space="preserve">, quantifying a near-total break in requisition-to-purchase-order traceability (under 0.2% of ~52,800 orders traced back to a requisition), an invoice-holds report whose supplier IDs matched zero of 3,337 records in any other financial report, and ~3,000 duplicate supplier IDs in a 376,000-row master file — each documented as a defect for remediation rather than forced into a false reconciliation.</w:t>
+      </w:r>
+    </w:p>
+    <w:p>
+      <w:pPr>
+        <w:pStyle w:val="ListParagraph"/>
+        <w:numPr>
+          <w:ilvl w:val="0"/>
+          <w:numId w:val="2"/>
+        </w:numPr>
+        <w:spacing w:before="30" w:after="30" w:line="276" w:lineRule="auto"/>
+      </w:pPr>
+      <w:r>
+        <w:rPr>
+          <w:b/>
+          <w:bCs/>
+        </w:rPr>
+        <w:t>Isolated $3,485,675.41 in open financial obligations across 184 line items</w:t>
+      </w:r>
+      <w:r>
+        <w:t xml:space="preserve"> by independently parsing a legacy purchase-order extract and tracing the fund's owning agency back to the fiscal circular that established it, resolving an ambiguity that had blocked analysis; separately quantified that two agencies accounted for 57% of all pending government payment obligations, a concentration finding used to prioritize cash-flow risk.</w:t>
+      </w:r>
+    </w:p>
+    <w:p>
+      <w:pPr>
+        <w:pStyle w:val="ListParagraph"/>
+        <w:numPr>
+          <w:ilvl w:val="0"/>
+          <w:numId w:val="2"/>
+        </w:numPr>
+        <w:spacing w:before="30" w:after="30" w:line="276" w:lineRule="auto"/>
+      </w:pPr>
+      <w:r>
+        <w:rPr>
+          <w:b/>
+          <w:bCs/>
+        </w:rPr>
+        <w:t>Audited a $5.3M public broadband contract line by line</w:t>
+      </w:r>
+      <w:r>
+        <w:t xml:space="preserve"> across a 27-site, 9-municipality public WiFi rollout, verifying vendor-reported equipment substitutions against manufacturer datasheets instead of the vendor's self-report; concluded only 1 of roughly 12 substitutions was a genuine contractual downgrade, isolating the real compliance issue without flagging legitimate engineering upgrades, and delivered bilingual audit reports with risk ratings to program leadership.</w:t>
+      </w:r>
+    </w:p>
+    <w:p>
+      <w:pPr>
+        <w:pStyle w:val="ListParagraph"/>
+        <w:numPr>
+          <w:ilvl w:val="0"/>
+          <w:numId w:val="2"/>
+        </w:numPr>
+        <w:spacing w:before="30" w:after="30" w:line="276" w:lineRule="auto"/>
+      </w:pPr>
+      <w:r>
+        <w:rPr>
+          <w:b/>
+          <w:bCs/>
+        </w:rPr>
+        <w:t>Scoped requirements for the Treasury and Budget Office's cloud financial reporting platform</w:t>
+      </w:r>
+      <w:r>
+        <w:t xml:space="preserve">, a data warehouse and dashboard stack fed by ETL from the Oracle Fusion Cloud enterprise resource planning system, specifying priority accounts-payable aging, budget-vs-actual, and federal-fund tracking reports, and authoring the bilingual user guide that let non-technical finance staff self-serve.</w:t>
+      </w:r>
+    </w:p>
+    <w:p>
+      <w:pPr>
+        <w:pStyle w:val="ListParagraph"/>
+        <w:numPr>
+          <w:ilvl w:val="0"/>
+          <w:numId w:val="2"/>
+        </w:numPr>
+        <w:spacing w:before="30" w:after="30" w:line="276" w:lineRule="auto"/>
+      </w:pPr>
+      <w:r>
+        <w:rPr>
+          <w:b/>
+          <w:bCs/>
+        </w:rPr>
+        <w:t>Served as client-facing point of contact to the Director of Public Finance</w:t>
+      </w:r>
+      <w:r>
+        <w:t xml:space="preserve">, delivering dashboards used directly by a Sub-Secretary of the Government of Puerto Rico; secured access to four Oracle Fusion Cloud modules (Payables, Procurement, Budgetary Control, General Ledger) by specifying the business question each request would answer, and sustained delivery through an extended cross-team access blocker by sourcing and reconciling equivalent production extracts.</w:t>
       </w:r>
     </w:p>
     <w:p>

</xml_diff>

<commit_message>
Trim HOD entry, add AWS to skills, remove em dash
- HOD: 4 bullets to 2, folding the same-week adoption / change management
  fact into the Power Apps bullet so no fact is lost
- Drop HOD Construction Operations Platform from Featured Projects
  (same-employer duplication with the HOD experience entry)
- Remove the forced page break before FEATURED PROJECTS so content flows
- Add AWS to Cloud & Platforms with no depth claim
- Replace the sole em dash with comma punctuation
</commit_message>
<xml_diff>
--- a/Pedro_Cardona_Master_Resume.docx
+++ b/Pedro_Cardona_Master_Resume.docx
@@ -274,7 +274,7 @@
         <w:t xml:space="preserve">Cloud &amp; Platforms  </w:t>
       </w:r>
       <w:r>
-        <w:t xml:space="preserve">Oracle Fusion Cloud ERP (Payables, Procurement, Budgetary Control, General Ledger), Microsoft Azure (Power Platform), Google Cloud (Firebase), Microsoft Power Apps, </w:t>
+        <w:t xml:space="preserve">Oracle Fusion Cloud ERP (Payables, Procurement, Budgetary Control, General Ledger), Microsoft Azure (Power Platform), AWS, Google Cloud (Firebase), Microsoft Power Apps, </w:t>
       </w:r>
       <w:proofErr w:type="spellStart"/>
       <w:r>
@@ -474,7 +474,7 @@
         <w:t>Surfaced internal-control gaps the government's own reporting had missed</w:t>
       </w:r>
       <w:r>
-        <w:t xml:space="preserve">, quantifying a near-total break in requisition-to-purchase-order traceability (under 0.2% of ~52,800 orders traced back to a requisition), an invoice-holds report whose supplier IDs matched zero of 3,337 records in any other financial report, and ~3,000 duplicate supplier IDs in a 376,000-row master file — each documented as a defect for remediation rather than forced into a false reconciliation.</w:t>
+        <w:t xml:space="preserve">, quantifying a near-total break in requisition-to-purchase-order traceability (under 0.2% of ~52,800 orders traced back to a requisition), an invoice-holds report whose supplier IDs matched zero of 3,337 records in any other financial report, and ~3,000 duplicate supplier IDs in a 376,000-row master file, all documented as defects for remediation rather than forced into a false reconciliation.</w:t>
       </w:r>
     </w:p>
     <w:p>
@@ -740,10 +740,7 @@
         <w:t>50+ field employees</w:t>
       </w:r>
       <w:r>
-        <w:t xml:space="preserve"> across active construction sites now clock in and out through a Microsoft Power Apps tool I co-developed, replacing paper timesheets </w:t>
-      </w:r>
-      <w:r>
-        <w:t>company wide</w:t>
+        <w:t xml:space="preserve"> across active construction sites now clock in and out through a Microsoft Power Apps tool I co-developed, replacing paper timesheets company wide, with same-week adoption across multiple job sites driven by hands-on training and change management</w:t>
       </w:r>
       <w:r>
         <w:t>.</w:t>
@@ -771,53 +768,6 @@
     </w:p>
     <w:p>
       <w:pPr>
-        <w:pStyle w:val="ListParagraph"/>
-        <w:numPr>
-          <w:ilvl w:val="0"/>
-          <w:numId w:val="2"/>
-        </w:numPr>
-        <w:spacing w:before="30" w:after="30" w:line="276" w:lineRule="auto"/>
-      </w:pPr>
-      <w:r>
-        <w:rPr>
-          <w:b/>
-          <w:bCs/>
-        </w:rPr>
-        <w:t>Built real-time Power BI dashboards</w:t>
-      </w:r>
-      <w:r>
-        <w:t xml:space="preserve"> tracking hours worked, crew locations, and tool adoption rates, giving site supervisors live visibility into labor allocation across concurrent projects.</w:t>
-      </w:r>
-    </w:p>
-    <w:p>
-      <w:pPr>
-        <w:pStyle w:val="ListParagraph"/>
-        <w:numPr>
-          <w:ilvl w:val="0"/>
-          <w:numId w:val="2"/>
-        </w:numPr>
-        <w:spacing w:before="30" w:after="30" w:line="276" w:lineRule="auto"/>
-      </w:pPr>
-      <w:r>
-        <w:rPr>
-          <w:b/>
-          <w:bCs/>
-        </w:rPr>
-        <w:t>Same-week tool adoption across multiple job sites</w:t>
-      </w:r>
-      <w:r>
-        <w:t xml:space="preserve"> through hands-on training and change management; translated site-</w:t>
-      </w:r>
-      <w:r>
-        <w:t>leading</w:t>
-      </w:r>
-      <w:r>
-        <w:t xml:space="preserve"> requirements into deployed tooling via cross-functional collaboration.</w:t>
-      </w:r>
-    </w:p>
-    <w:p>
-      <w:pPr>
-        <w:pageBreakBefore/>
         <w:pBdr>
           <w:bottom w:val="single" w:sz="6" w:space="2" w:color="1A365D"/>
         </w:pBdr>
@@ -832,7 +782,6 @@
           <w:sz w:val="24"/>
           <w:szCs w:val="24"/>
         </w:rPr>
-        <w:lastRenderedPageBreak/>
         <w:t>FEATURED PROJECTS</w:t>
       </w:r>
     </w:p>
@@ -847,47 +796,6 @@
           <w:color w:val="595959"/>
         </w:rPr>
         <w:t>Full case studies and live demos at the portfolio link above.</w:t>
-      </w:r>
-    </w:p>
-    <w:p>
-      <w:pPr>
-        <w:spacing w:before="60" w:after="30" w:line="276" w:lineRule="auto"/>
-      </w:pPr>
-      <w:r>
-        <w:rPr>
-          <w:b/>
-          <w:bCs/>
-        </w:rPr>
-        <w:t>HOD Construction Operations Platform</w:t>
-      </w:r>
-      <w:r>
-        <w:rPr>
-          <w:i/>
-          <w:iCs/>
-          <w:color w:val="595959"/>
-        </w:rPr>
-        <w:t xml:space="preserve">  (React, Vite, Firebase, es-PR/</w:t>
-      </w:r>
-      <w:proofErr w:type="spellStart"/>
-      <w:r>
-        <w:rPr>
-          <w:i/>
-          <w:iCs/>
-          <w:color w:val="595959"/>
-        </w:rPr>
-        <w:t>en</w:t>
-      </w:r>
-      <w:proofErr w:type="spellEnd"/>
-      <w:r>
-        <w:rPr>
-          <w:i/>
-          <w:iCs/>
-          <w:color w:val="595959"/>
-        </w:rPr>
-        <w:t xml:space="preserve"> bilingual)  </w:t>
-      </w:r>
-      <w:r>
-        <w:t>Independent build extending field-deployed work into a full ops system: owner morning-briefing view, project board, materials request flow, Firebase backend. Designed around minimizing required interaction, prioritizing automatic reporting over dashboards and supporting existing field workflows rather than replacing them.</w:t>
       </w:r>
     </w:p>
     <w:p>

</xml_diff>

<commit_message>
Rewrite summary, correct AOM attribution, add one-page application version
Master:
- Rewrite SUMMARY around the ERP program instead of e-STEPS/HOD
- Soften AOM attribution on the ERP build: contribution-level verbs on the
  platform build, delivery engineering, and BI requirements; independent
  analytical findings keep strong verbs
- Remove bare Python from skills (no unaided Python); add an AI-Assisted
  Development line and an AI-Assisted Internal Tooling project entry
- Add Excel to skills
- Education: add Dean's List; fold certifications into an in-progress line
  and drop the CERTIFICATIONS section
- Fix stray backtick in the header (Penn State `27 -> Class of 2027)

New: Pedro_Cardona_Resume_1Page.docx, a one-page application version
(4 AOM bullets, 1 each for e-STEPS and HOD, condensed skills, no projects
section, tighter leading and margins)
</commit_message>
<xml_diff>
--- a/Pedro_Cardona_Master_Resume.docx
+++ b/Pedro_Cardona_Master_Resume.docx
@@ -62,7 +62,7 @@
           <w:sz w:val="22"/>
           <w:szCs w:val="22"/>
         </w:rPr>
-        <w:t>`</w:t>
+        <w:t xml:space="preserve">Class of 20</w:t>
       </w:r>
       <w:r>
         <w:rPr>
@@ -199,7 +199,7 @@
         <w:spacing w:before="60" w:after="60" w:line="276" w:lineRule="auto"/>
       </w:pPr>
       <w:r>
-        <w:t>Build and ship production tooling that runs active operations. Cut report runtimes ~40% at e-STEPS by re-architecting the SQL layer; collapsed multi-day payroll cycles to instant at HOD Investment with a Microsoft Power Apps tool now used by 50+ field employees. Strongest at the intersection of backend data work, frontend delivery, and field-deployed change management. Bilingual (English/Spanish), pursuing CompTIA Security+ and a USAF Reserve commission on the cyber/intelligence track.</w:t>
+        <w:t>Business analyst on a government enterprise resource planning modernization, most useful where the data does not agree with itself yet. Reconciled $3.9B in purchase order activity to the cent across eight production finance systems, surfaced internal-control gaps the official reporting had missed, and delivered dashboards used by a Sub-Secretary of the Government of Puerto Rico. Earlier, cut production report runtimes ~40% at e-STEPS and moved 50+ field crews off paper timesheets at HOD Investment. Penn State Enterprise Technology Integration, class of 2027; bilingual English/Spanish.</w:t>
       </w:r>
     </w:p>
     <w:p>
@@ -234,7 +234,7 @@
         <w:t xml:space="preserve">Backend &amp; Data  </w:t>
       </w:r>
       <w:r>
-        <w:t>SQL (query optimization, indexing, joins), Python (API automation, data parsing), JavaScript, Java, REST APIs, Firebase, Power BI, dashboard development, ETL workflows, large-scale data reconciliation</w:t>
+        <w:t>SQL (query optimization, indexing, joins), JavaScript, Java, REST APIs, Firebase, Power BI, Excel, dashboard development, ETL workflows, large-scale data reconciliation</w:t>
       </w:r>
     </w:p>
     <w:p>
@@ -296,6 +296,22 @@
       </w:r>
       <w:r>
         <w:t>Git, GitHub, Agile, business process analysis (procure-to-pay), requirements gathering, vendor &amp; contract compliance review, executive stakeholder communication, bilingual technical documentation, cross-functional delivery, change management, user training</w:t>
+      </w:r>
+    </w:p>
+    <w:p>
+      <w:pPr>
+        <w:spacing w:before="25" w:after="25" w:line="276" w:lineRule="auto"/>
+      </w:pPr>
+      <w:r>
+        <w:rPr>
+          <w:b/>
+          <w:bCs/>
+          <w:color w:val="1A365D"/>
+        </w:rPr>
+        <w:t xml:space="preserve">AI-Assisted Development  </w:t>
+      </w:r>
+      <w:r>
+        <w:t>Specifying, directing, and testing production tools built with AI coding assistants (Python, HTML/JavaScript); requirement definition, output verification, and functional testing of AI-generated code</w:t>
       </w:r>
     </w:p>
     <w:p>
@@ -411,10 +427,10 @@
           <w:b/>
           <w:bCs/>
         </w:rPr>
-        <w:t>Designed and directed the build of the Government of Puerto Rico's first unified procure-to-pay analytics platform</w:t>
-      </w:r>
-      <w:r>
-        <w:t xml:space="preserve">, consolidating 8 production data extracts (~240,000 rows across 40 spreadsheet tabs) from multiple government finance systems into a single 10-view application spanning requisition through invoice three-way match for ~8,800 suppliers across 60 agencies.</w:t>
+        <w:t>Consolidated 8 production data extracts (~240,000 rows across 40 spreadsheet tabs)</w:t>
+      </w:r>
+      <w:r>
+        <w:t xml:space="preserve"> from multiple government finance systems into the Puerto Rico government's first unified procure-to-pay analytics view, covering ~8,800 suppliers across 60 agencies from requisition through invoice three-way match in a single 10-view application.</w:t>
       </w:r>
     </w:p>
     <w:p>
@@ -451,10 +467,10 @@
           <w:b/>
           <w:bCs/>
         </w:rPr>
-        <w:t>Engineered the full data pipeline to run offline</w:t>
-      </w:r>
-      <w:r>
-        <w:t xml:space="preserve"> for a client with no guaranteed internet access, compressing a 24.5MB dataset to a 5.46MB self-contained file via dictionary encoding and gzip/base64 with in-browser decompression and zero external dependencies; diagnosed a production hang traced to a hidden CDN dependency, rebuilt every code path to fail visibly rather than stall, and re-verified on a fully disconnected machine with an automated functional test suite.</w:t>
+        <w:t>Assisted on the delivery engineering that made the platform run fully offline</w:t>
+      </w:r>
+      <w:r>
+        <w:t xml:space="preserve"> for a client with no guaranteed internet access, compressing a 24.5MB dataset to a 5.46MB self-contained file via dictionary encoding and gzip/base64 with in-browser decompression and zero external dependencies; helped diagnose a production hang traced to a hidden CDN dependency, and re-verified the fix on a fully disconnected machine against an automated functional test suite.</w:t>
       </w:r>
     </w:p>
     <w:p>
@@ -531,7 +547,7 @@
           <w:b/>
           <w:bCs/>
         </w:rPr>
-        <w:t>Scoped requirements for the Treasury and Budget Office's cloud financial reporting platform</w:t>
+        <w:t>Contributed requirements for the Treasury and Budget Office's cloud financial reporting platform</w:t>
       </w:r>
       <w:r>
         <w:t xml:space="preserve">, a data warehouse and dashboard stack fed by ETL from the Oracle Fusion Cloud enterprise resource planning system, specifying priority accounts-payable aging, budget-vs-actual, and federal-fund tracking reports, and authoring the bilingual user guide that let non-technical finance staff self-serve.</w:t>
@@ -800,6 +816,27 @@
     </w:p>
     <w:p>
       <w:pPr>
+        <w:spacing w:before="30" w:after="30" w:line="276" w:lineRule="auto"/>
+      </w:pPr>
+      <w:r>
+        <w:rPr>
+          <w:b/>
+          <w:bCs/>
+        </w:rPr>
+        <w:t xml:space="preserve">AI-Assisted Internal Tooling  </w:t>
+      </w:r>
+      <w:r>
+        <w:rPr>
+          <w:color w:val="595959"/>
+        </w:rPr>
+        <w:t xml:space="preserve">(Python, HTML/JavaScript, Clockify API)  </w:t>
+      </w:r>
+      <w:r>
+        <w:t>Specified, directed, and tested working tools built with AI coding assistants: a document-generation automation for a permitting and project-development practice that replaced one-by-one manual drafting, a Clockify API reporting tool that produces submission-ready monthly reports, and a spaced-repetition study application for medical-school exam prep.</w:t>
+      </w:r>
+    </w:p>
+    <w:p>
+      <w:pPr>
         <w:spacing w:before="60" w:after="30" w:line="276" w:lineRule="auto"/>
       </w:pPr>
       <w:r>
@@ -933,6 +970,22 @@
     </w:p>
     <w:p>
       <w:pPr>
+        <w:spacing w:after="50" w:line="276" w:lineRule="auto"/>
+      </w:pPr>
+      <w:r>
+        <w:rPr>
+          <w:b/>
+          <w:bCs/>
+          <w:color w:val="1A365D"/>
+        </w:rPr>
+        <w:t xml:space="preserve">Dean’s List  </w:t>
+      </w:r>
+      <w:r>
+        <w:t>Multiple semesters</w:t>
+      </w:r>
+    </w:p>
+    <w:p>
+      <w:pPr>
         <w:spacing w:line="276" w:lineRule="auto"/>
       </w:pPr>
       <w:r>
@@ -949,73 +1002,18 @@
     </w:p>
     <w:p>
       <w:pPr>
-        <w:pBdr>
-          <w:bottom w:val="single" w:sz="6" w:space="2" w:color="1A365D"/>
-        </w:pBdr>
-        <w:spacing w:before="200" w:after="60" w:line="276" w:lineRule="auto"/>
+        <w:spacing w:before="25" w:line="276" w:lineRule="auto"/>
       </w:pPr>
       <w:r>
         <w:rPr>
           <w:b/>
           <w:bCs/>
           <w:color w:val="1A365D"/>
-          <w:spacing w:val="20"/>
-          <w:sz w:val="24"/>
-          <w:szCs w:val="24"/>
-        </w:rPr>
-        <w:t>CERTIFICATIONS &amp; PROFESSIONAL DEVELOPMENT</w:t>
-      </w:r>
-    </w:p>
-    <w:p>
-      <w:pPr>
-        <w:pStyle w:val="ListParagraph"/>
-        <w:numPr>
-          <w:ilvl w:val="0"/>
-          <w:numId w:val="2"/>
-        </w:numPr>
-        <w:spacing w:before="30" w:after="30" w:line="276" w:lineRule="auto"/>
-      </w:pPr>
-      <w:r>
-        <w:rPr>
-          <w:b/>
-          <w:bCs/>
-        </w:rPr>
-        <w:t>CompTIA Security+ (SY0-701)</w:t>
-      </w:r>
-      <w:r>
-        <w:t xml:space="preserve">, </w:t>
-      </w:r>
-      <w:r>
-        <w:t>Target</w:t>
-      </w:r>
-      <w:r>
-        <w:t xml:space="preserve"> </w:t>
-      </w:r>
-      <w:r>
-        <w:t>August</w:t>
-      </w:r>
-      <w:r>
-        <w:t xml:space="preserve"> 2026</w:t>
-      </w:r>
-    </w:p>
-    <w:p>
-      <w:pPr>
-        <w:pStyle w:val="ListParagraph"/>
-        <w:numPr>
-          <w:ilvl w:val="0"/>
-          <w:numId w:val="2"/>
-        </w:numPr>
-        <w:spacing w:before="30" w:after="30" w:line="276" w:lineRule="auto"/>
-      </w:pPr>
-      <w:r>
-        <w:rPr>
-          <w:b/>
-          <w:bCs/>
-        </w:rPr>
-        <w:t xml:space="preserve">ITIL, </w:t>
-      </w:r>
-      <w:r>
-        <w:t>Target December 2026</w:t>
+        </w:rPr>
+        <w:t xml:space="preserve">Certifications in Progress  </w:t>
+      </w:r>
+      <w:r>
+        <w:t>CompTIA Security+ (SY0-701), ITIL Foundation</w:t>
       </w:r>
     </w:p>
     <w:p>

</xml_diff>